<commit_message>
updated to a graph
</commit_message>
<xml_diff>
--- a/public/AI_In_Schools_Essay_Taylor_Houghtaling.docx
+++ b/public/AI_In_Schools_Essay_Taylor_Houghtaling.docx
@@ -157,20 +157,20 @@
           <w:sz w:val="24"/>
           <w:szCs w:val="24"/>
         </w:rPr>
-        <w:t xml:space="preserve">The numbers on AI adoption are not just large — they are moving fast in one direction. In 2023, McKinsey found that one-third of organizations were already regularly using generative AI in at least one business function, and 40 percent of those organizations planned to increase AI investment. Two years later, Wharton's research showed 92 percent of companies planned to increase that investment — more than double (Korst et al., 2025). By February 2026, Gallup's national survey of nearly 24,000 employees found 41 percent reporting that their organization had integrated AI tools, with 65 percent of those workers saying AI had improved their productivity (Gallup, 2026). Morgan Stanley found an average 11.5 percent net productivity gain across the sectors most exposed to AI adoption (Morgan Stanley, 2026).</w:t>
-      </w:r>
-    </w:p>
-    <w:p>
-      <w:pPr>
-        <w:spacing w:after="240" w:line="480"/>
-      </w:pPr>
-      <w:r>
-        <w:rPr>
-          <w:rFonts w:ascii="Times New Roman" w:cs="Times New Roman" w:eastAsia="Times New Roman" w:hAnsi="Times New Roman"/>
-          <w:sz w:val="24"/>
-          <w:szCs w:val="24"/>
-        </w:rPr>
-        <w:t xml:space="preserve">That trajectory matters for students. A first-year enrolling today graduates in 2029 into a labor market shaped by those numbers. If schools wait for the conversation to feel more settled before addressing AI in classrooms, they will have spent four years producing graduates who are behind on day one. Teaching students to use AI well — critically, responsibly, with an eye toward verification and revision — is not lowering the bar. It is updating what the bar actually requires.</w:t>
+        <w:t xml:space="preserve">The numbers on AI adoption are not just large — they are moving fast, and the Federal Reserve has put the most authoritative figures on the table. The Fed's April 2026 analysis finds that 78 percent of the entire U.S. labor force already works at a firm that has adopted AI. More specifically, 54 percent work at firms using large language models — the same category of AI a student would use for writing. Firm-level adoption grew 68 percent in the single year ending September 2025. In 2023, McKinsey found 40 percent of AI-adopting organizations planned to increase investment further. By 2025, Wharton showed 92 percent planned the same — more than double in two years. Gallup's 2026 survey of nearly 24,000 employees found 65 percent of workers in AI-adopting organizations reporting that AI improved their productivity (Gallup, 2026). Morgan Stanley confirmed the output: an average 11.5 percent net productivity gain across sectors most exposed (Morgan Stanley, 2026).</w:t>
+      </w:r>
+    </w:p>
+    <w:p>
+      <w:pPr>
+        <w:spacing w:after="240" w:line="480"/>
+      </w:pPr>
+      <w:r>
+        <w:rPr>
+          <w:rFonts w:ascii="Times New Roman" w:cs="Times New Roman" w:eastAsia="Times New Roman" w:hAnsi="Times New Roman"/>
+          <w:sz w:val="24"/>
+          <w:szCs w:val="24"/>
+        </w:rPr>
+        <w:t xml:space="preserve">That trajectory matters for students. A first-year enrolling today graduates in 2029 into a labor market where 78 percent of workers are already inside AI-adopting firms. If schools wait for the conversation to feel more settled, they will spend four years producing graduates who are behind on day one. Teaching students to use AI well — critically, responsibly, with an eye toward verification and revision — is not lowering the bar. It is updating what the bar actually requires.</w:t>
       </w:r>
     </w:p>
     <w:p>
@@ -252,7 +252,7 @@
           <w:sz w:val="24"/>
           <w:szCs w:val="24"/>
         </w:rPr>
-        <w:t xml:space="preserve">One of the things that struck me while researching this essay is how quickly the data moved. The shift from 40 percent of AI-adopting companies planning to increase investment in 2023 to 92 percent planning to do so in 2025 happened in two years. That is not a gradual cultural shift — that is an industry making a decision. The students sitting in high school classrooms right now will graduate into that decision. Schools have a narrowing window to give them the tools to navigate it.</w:t>
+        <w:t xml:space="preserve">One of the things that struck me while researching this essay is how quickly the data moved — and how authoritative the sources have become. In 2023, 40 percent of AI-adopting companies planned to increase investment. By 2025, 92 percent planned the same. Those numbers come from McKinsey and Wharton. But the Federal Reserve's April 2026 analysis, drawing on Census Bureau data and a survey of senior business executives, adds something harder: 78 percent of the U.S. labor force already works at a firm that has adopted AI. 54 percent works at firms using large language models specifically. Firm-level adoption grew 68 percent in a single year. When the Federal Reserve is tracking this as an economic indicator, it is no longer a tech trend. It is infrastructure.</w:t>
       </w:r>
     </w:p>
     <w:p>

</xml_diff>